<commit_message>
Sync hourly and fixed templates with latest client-provided versions
Adopt the user's most-updated HOURLY and FIXED templates:
- Amendment clauses now use email-confirmable wording (no signature/addendum)
- Cover proof points restacked; 'CFO Level Advisory'
- Added 'Section 1' / 'Section 2' labels
- Removed the '[Insert Governance Group Name] and Management' line
- Employment fee updated to $200k CFO / $150k controller / $100k staff,
  90-day solicitation lookback
- Retains the 7-year record-retention clause

Co-Authored-By: Claude Opus 4.8 <noreply@anthropic.com>
Claude-Session: https://claude.ai/code/session_01RfN2m1kgBo1xCWLXRNw2zV
</commit_message>
<xml_diff>
--- a/Onyx_Engagement_Letter_FIXED.docx
+++ b/Onyx_Engagement_Letter_FIXED.docx
@@ -258,7 +258,7 @@
     <w:p>
       <w:pPr>
         <w:pStyle w:val="CLAProNormalNoSpaceAfter"/>
-        <w:ind w:left="4140"/>
+        <w:ind w:left="4140" w:hanging="4590"/>
       </w:pPr>
       <w:r>
         <w:rPr>
@@ -270,10 +270,37 @@
     <w:p>
       <w:pPr>
         <w:pStyle w:val="CLAProNormalNoSpaceAfter"/>
-        <w:ind w:left="4140"/>
-      </w:pPr>
-      <w:r>
-        <w:t xml:space="preserve">Day-to-day bookkeeping   ·   Controller-level oversight   ·   Cash-flow management   ·   Always-on advisory</w:t>
+        <w:ind w:left="4140" w:hanging="4590"/>
+      </w:pPr>
+      <w:r>
+        <w:t xml:space="preserve">·   Bookkeeping support</w:t>
+      </w:r>
+    </w:p>
+    <w:p>
+      <w:pPr>
+        <w:pStyle w:val="CLAProNormalNoSpaceAfter"/>
+        <w:ind w:left="4140" w:hanging="4590"/>
+      </w:pPr>
+      <w:r>
+        <w:t xml:space="preserve">·   Controller-level oversight</w:t>
+      </w:r>
+    </w:p>
+    <w:p>
+      <w:pPr>
+        <w:pStyle w:val="CLAProNormalNoSpaceAfter"/>
+        <w:ind w:left="4140" w:hanging="4590"/>
+      </w:pPr>
+      <w:r>
+        <w:t xml:space="preserve">·   Review &amp; audit readiness</w:t>
+      </w:r>
+    </w:p>
+    <w:p>
+      <w:pPr>
+        <w:pStyle w:val="CLAProNormalNoSpaceAfter"/>
+        <w:ind w:left="4140" w:hanging="4590"/>
+      </w:pPr>
+      <w:r>
+        <w:t xml:space="preserve">·   CFO Level Advisory</w:t>
       </w:r>
     </w:p>
     <w:p>
@@ -422,78 +449,6 @@
         <w:pStyle w:val="CLALTRAddressorSignature"/>
       </w:pPr>
       <w:r>
-        <w:rPr>
-          <w:highlight w:val="yellow"/>
-        </w:rPr>
-        <w:fldChar w:fldCharType="begin">
-          <w:ffData>
-            <w:name w:val="Text36"/>
-            <w:enabled/>
-            <w:calcOnExit w:val="0"/>
-            <w:textInput>
-              <w:default w:val="[Insert Governance Group Name]"/>
-            </w:textInput>
-          </w:ffData>
-        </w:fldChar>
-      </w:r>
-      <w:r>
-        <w:rPr>
-          <w:highlight w:val="yellow"/>
-        </w:rPr>
-        <w:instrText xml:space="preserve"> FORMTEXT </w:instrText>
-      </w:r>
-      <w:r>
-        <w:rPr>
-          <w:highlight w:val="yellow"/>
-        </w:rPr>
-      </w:r>
-      <w:r>
-        <w:rPr>
-          <w:highlight w:val="yellow"/>
-        </w:rPr>
-        <w:fldChar w:fldCharType="separate"/>
-      </w:r>
-      <w:r>
-        <w:rPr>
-          <w:noProof/>
-          <w:highlight w:val="yellow"/>
-        </w:rPr>
-        <w:t>[Insert Governance Group Name]</w:t>
-      </w:r>
-      <w:r>
-        <w:rPr>
-          <w:highlight w:val="yellow"/>
-        </w:rPr>
-        <w:fldChar w:fldCharType="end"/>
-      </w:r>
-      <w:bookmarkEnd w:id="1"/>
-      <w:r>
-        <w:rPr>
-          <w:highlight w:val="yellow"/>
-        </w:rPr>
-        <w:t xml:space="preserve"> and</w:t>
-      </w:r>
-      <w:r>
-        <w:t xml:space="preserve"> Management</w:t>
-      </w:r>
-      <w:r>
-        <w:rPr>
-          <w:rStyle w:val="CLALTRHiddenTextChar"/>
-        </w:rPr>
-        <w:t xml:space="preserve"> </w:t>
-      </w:r>
-      <w:r>
-        <w:rPr>
-          <w:rStyle w:val="CLALTRHiddenTextChar"/>
-        </w:rPr>
-        <w:t xml:space="preserve">   </w:t>
-      </w:r>
-    </w:p>
-    <w:p>
-      <w:pPr>
-        <w:pStyle w:val="CLALTRAddressorSignature"/>
-      </w:pPr>
-      <w:r>
         <w:fldChar w:fldCharType="begin">
           <w:ffData>
             <w:name w:val="Text46"/>
@@ -880,7 +835,7 @@
         <w:rPr>
           <w:b/>
         </w:rPr>
-        <w:t>signed by both ONYX and the Client</w:t>
+        <w:t>including by email, agreed to by both ONYX and the Client</w:t>
       </w:r>
       <w:r>
         <w:t>.</w:t>
@@ -889,9 +844,31 @@
     <w:p>
       <w:pPr>
         <w:pStyle w:val="CLALTRHeading1"/>
-        <w:jc w:val="both"/>
-      </w:pPr>
-      <w:r>
+        <w:pBdr>
+          <w:top w:val="single" w:sz="8" w:space="10" w:color="auto"/>
+          <w:bottom w:val="single" w:sz="8" w:space="10" w:color="auto"/>
+        </w:pBdr>
+        <w:spacing w:before="240" w:after="200"/>
+        <w:jc w:val="both"/>
+      </w:pPr>
+      <w:r>
+        <w:rPr>
+          <w:caps/>
+          <w:color w:val="7F7F7F"/>
+          <w:sz w:val="18"/>
+          <w:szCs w:val="18"/>
+          <w:spacing w:val="60"/>
+        </w:rPr>
+        <w:t xml:space="preserve">Section 1</w:t>
+      </w:r>
+      <w:r>
+        <w:br/>
+      </w:r>
+      <w:r>
+        <w:rPr>
+          <w:sz w:val="48"/>
+          <w:szCs w:val="48"/>
+        </w:rPr>
         <w:t xml:space="preserve">What we’ll do for you</w:t>
       </w:r>
     </w:p>
@@ -1783,7 +1760,7 @@
         <w:jc w:val="both"/>
       </w:pPr>
       <w:r>
-        <w:t xml:space="preserve">Your needs will evolve as your business grows, and this engagement is built to flex with them. Services can be added, reduced, or adjusted at any time by mutual written agreement — typically a brief addendum to this letter rather than a new engagement letter — with fees adjusted accordingly. All other terms of this agreement remain in effect, so adding or removing a service never requires starting over.</w:t>
+        <w:t xml:space="preserve">Your needs will evolve as your business grows, and this engagement is built to flex with them. Services can be added, reduced, or adjusted at any time by mutual written agreement — including by email, with no formal addendum or new engagement letter required. All other terms of this agreement remain in effect, so adding or removing a service never requires starting over.</w:t>
       </w:r>
     </w:p>
     <w:p>
@@ -2976,7 +2953,7 @@
         <w:jc w:val="both"/>
       </w:pPr>
       <w:r>
-        <w:t xml:space="preserve">To ensure that ONYX’s services remain responsive to the Client’s needs, and fair to both parties, ONYX will meet with the Client throughout the term of this agreement and, as needs change, revise or adjust the scope of services and the related fees — without the need to re-execute this agreement. Such revisions or adjustments are not binding unless made in writing and signed by both ONYX and the Client.</w:t>
+        <w:t xml:space="preserve">To ensure that ONYX’s services remain responsive to the Client’s needs, and fair to both parties, ONYX will meet with the Client throughout the term of this agreement and, as needs change, revise or adjust the scope of services and the related fees — without the need to re-execute this agreement. Such revisions or adjustments take effect once confirmed in writing, including by email, by both ONYX and the Client; no signature, formal addendum, or re-execution of this agreement is required.</w:t>
       </w:r>
     </w:p>
     <w:p>
@@ -3018,9 +2995,31 @@
       <w:pPr>
         <w:pStyle w:val="CLALTRHeading1"/>
         <w:pageBreakBefore/>
-        <w:jc w:val="both"/>
-      </w:pPr>
-      <w:r>
+        <w:pBdr>
+          <w:top w:val="single" w:sz="8" w:space="10" w:color="auto"/>
+          <w:bottom w:val="single" w:sz="8" w:space="10" w:color="auto"/>
+        </w:pBdr>
+        <w:spacing w:before="240" w:after="200"/>
+        <w:jc w:val="both"/>
+      </w:pPr>
+      <w:r>
+        <w:rPr>
+          <w:caps/>
+          <w:color w:val="7F7F7F"/>
+          <w:sz w:val="18"/>
+          <w:szCs w:val="18"/>
+          <w:spacing w:val="60"/>
+        </w:rPr>
+        <w:t xml:space="preserve">Section 2</w:t>
+      </w:r>
+      <w:r>
+        <w:br/>
+      </w:r>
+      <w:r>
+        <w:rPr>
+          <w:sz w:val="48"/>
+          <w:szCs w:val="48"/>
+        </w:rPr>
         <w:t xml:space="preserve">Terms and Conditions</w:t>
       </w:r>
     </w:p>
@@ -4009,13 +4008,10 @@
         <w:rPr>
           <w:b/>
         </w:rPr>
-        <w:t>Record retention.</w:t>
-      </w:r>
-      <w:r>
-        <w:rPr>
-          <w:b w:val="0"/>
-        </w:rPr>
-        <w:t xml:space="preserve"> ONYX will retain its working papers, supporting schedules, and other documentation prepared in connection with this engagement for a period of seven (7) years from the completion of the applicable services, after which ONYX may destroy or otherwise dispose of such records without further notice to the Client. Working papers and other documents prepared by ONYX in the course of the engagement remain the property of ONYX. Original records, source documents, and other materials furnished by the Client remain the property of the Client and will be returned upon written request. The Client is responsible for maintaining its own copies of its records and for meeting its own record-retention obligations. ONYX has no obligation to retain any records or data beyond the seven (7) year period and may maintain such records in electronic form.</w:t>
+        <w:t xml:space="preserve">Record retention.  </w:t>
+      </w:r>
+      <w:r>
+        <w:t xml:space="preserve">ONYX will retain its working papers, supporting schedules, and other documentation prepared in connection with this engagement for a period of seven (7) years from the completion of the applicable services, after which ONYX may destroy or otherwise dispose of such records without further notice to the Client. Working papers and other documents prepared by ONYX in the course of the engagement remain the property of ONYX. Original records, source documents, and other materials furnished by the Client remain the property of the Client and will be returned upon written request. The Client is responsible for maintaining its own copies of its records and for meeting its own record-retention obligations. ONYX has no obligation to retain any records or data beyond the seven (7) year period and may maintain such records in electronic form.</w:t>
       </w:r>
     </w:p>
     <w:p>
@@ -4125,7 +4121,7 @@
         <w:rPr>
           <w:highlight w:val="yellow"/>
         </w:rPr>
-        <w:t>$60,000 for the controller and $25,000 for the staff</w:t>
+        <w:t>$200,000 for the CFO, $150,000 for the controller, and $100,000 for the staff</w:t>
       </w:r>
       <w:r>
         <w:t xml:space="preserve"> to </w:t>
@@ -4163,7 +4159,7 @@
         <w:t xml:space="preserve"> within</w:t>
       </w:r>
       <w:r>
-        <w:t xml:space="preserve"> sixty</w:t>
+        <w:t xml:space="preserve"> ninety</w:t>
       </w:r>
       <w:r>
         <w:t xml:space="preserve"> </w:t>
@@ -4172,7 +4168,7 @@
         <w:t>(</w:t>
       </w:r>
       <w:r>
-        <w:t>60</w:t>
+        <w:t>90</w:t>
       </w:r>
       <w:r>
         <w:t>)</w:t>

</xml_diff>

<commit_message>
Correct Steven's direct phone in templates
Updated direct number to 480-999-5509 (was 480-442-3119) in the hourly
and fixed templates. Mobile unchanged.

Co-Authored-By: Claude Opus 4.8 <noreply@anthropic.com>
Claude-Session: https://claude.ai/code/session_01RfN2m1kgBo1xCWLXRNw2zV
</commit_message>
<xml_diff>
--- a/Onyx_Engagement_Letter_FIXED.docx
+++ b/Onyx_Engagement_Letter_FIXED.docx
@@ -360,7 +360,7 @@
         <w:t xml:space="preserve">direct </w:t>
       </w:r>
       <w:r>
-        <w:t>480-442-3119</w:t>
+        <w:t>480-999-5509</w:t>
       </w:r>
       <w:r>
         <w:t xml:space="preserve"> | mobile </w:t>
@@ -4473,7 +4473,7 @@
         <w:pStyle w:val="CLALTRAddressorSignature"/>
       </w:pPr>
       <w:r>
-        <w:t>480-442-3119</w:t>
+        <w:t>480-999-5509</w:t>
       </w:r>
     </w:p>
     <w:p>

</xml_diff>

<commit_message>
Bake recurring letter fixes into templates + record conventions
Templates (HOURLY and FIXED):
- Unbolded the evergreen/amendment clause in the opening paragraph
- Removed the stray 'the' before [identify the work product] so filling it
  no longer produces 'the the books and supporting schedules'

Added CLAUDE.md with the working conventions for future letters: no
em-dashes in the proposal prose, strip highlights + flatten fields before
sending, consistent 'dba', ONYX does not do tax/filing (supports audits
only), hourly + year-end rate guarantee + new-client retainer, and the
prepared-by contact.

Co-Authored-By: Claude Opus 4.8 <noreply@anthropic.com>
Claude-Session: https://claude.ai/code/session_01RfN2m1kgBo1xCWLXRNw2zV
</commit_message>
<xml_diff>
--- a/Onyx_Engagement_Letter_FIXED.docx
+++ b/Onyx_Engagement_Letter_FIXED.docx
@@ -761,79 +761,79 @@
       </w:r>
       <w:r>
         <w:rPr>
-          <w:b/>
+          <w:b w:val="0"/>
         </w:rPr>
         <w:t xml:space="preserve">will apply to the </w:t>
       </w:r>
       <w:r>
         <w:rPr>
-          <w:b/>
+          <w:b w:val="0"/>
         </w:rPr>
         <w:t>I</w:t>
       </w:r>
       <w:r>
         <w:rPr>
-          <w:b/>
+          <w:b w:val="0"/>
         </w:rPr>
         <w:t>nitial</w:t>
       </w:r>
       <w:r>
         <w:rPr>
-          <w:b/>
+          <w:b w:val="0"/>
         </w:rPr>
         <w:t xml:space="preserve"> Period</w:t>
       </w:r>
       <w:r>
         <w:rPr>
-          <w:b/>
+          <w:b w:val="0"/>
         </w:rPr>
         <w:t>,</w:t>
       </w:r>
       <w:r>
         <w:rPr>
-          <w:b/>
+          <w:b w:val="0"/>
         </w:rPr>
         <w:t xml:space="preserve"> and all subsequent </w:t>
       </w:r>
       <w:r>
         <w:rPr>
-          <w:b/>
+          <w:b w:val="0"/>
         </w:rPr>
         <w:t>periods</w:t>
       </w:r>
       <w:r>
         <w:rPr>
-          <w:b/>
+          <w:b w:val="0"/>
         </w:rPr>
         <w:t xml:space="preserve">, unless the </w:t>
       </w:r>
       <w:r>
         <w:rPr>
-          <w:b/>
+          <w:b w:val="0"/>
         </w:rPr>
         <w:t>terms of our engagement are</w:t>
       </w:r>
       <w:r>
         <w:rPr>
-          <w:b/>
+          <w:b w:val="0"/>
         </w:rPr>
         <w:t xml:space="preserve"> changed in a </w:t>
       </w:r>
       <w:r>
         <w:rPr>
-          <w:b/>
+          <w:b w:val="0"/>
         </w:rPr>
         <w:t xml:space="preserve">written </w:t>
       </w:r>
       <w:r>
         <w:rPr>
-          <w:b/>
+          <w:b w:val="0"/>
         </w:rPr>
         <w:t xml:space="preserve">communication </w:t>
       </w:r>
       <w:r>
         <w:rPr>
-          <w:b/>
+          <w:b w:val="0"/>
         </w:rPr>
         <w:t>including by email, agreed to by both ONYX and the Client</w:t>
       </w:r>
@@ -2494,7 +2494,7 @@
         <w:t xml:space="preserve">the Client </w:t>
       </w:r>
       <w:r>
-        <w:t xml:space="preserve">with the </w:t>
+        <w:t xml:space="preserve">with </w:t>
       </w:r>
       <w:r>
         <w:fldChar w:fldCharType="begin">

</xml_diff>

<commit_message>
George Brazil: clean logos, name Jessica as controller, retainer to first invoice
Proposal deck: replaced the low-resolution logos with the full George Brazil
logo Steven supplied and the high-resolution ONYX wordmark from the letter
template (white version on the dark cover and closing slides). Jessica
Bumphus is named as the ONYX controller on the engagement team slide. The
retainer is now described as applied to the first invoice.

Templates (HOURLY and FIXED): the Retainer paragraph now applies the
retainer to ONYX's first invoice instead of the final invoice, with any
unapplied balance carried forward and refunded if unused. Recorded in
REWRITE-WALKTHROUGH.md and as a standing rule in CLAUDE.md.

Co-Authored-By: Claude Fable 5.1 <noreply@anthropic.com>
Claude-Session: https://claude.ai/code/session_01UFyPstJ3vPVTCKGNZ5pVUz
</commit_message>
<xml_diff>
--- a/Onyx_Engagement_Letter_FIXED.docx
+++ b/Onyx_Engagement_Letter_FIXED.docx
@@ -2778,19 +2778,19 @@
         <w:rPr>
           <w:highlight w:val="yellow"/>
         </w:rPr>
-        <w:t>final invoice</w:t>
-      </w:r>
-      <w:r>
-        <w:rPr>
-          <w:highlight w:val="yellow"/>
-        </w:rPr>
-        <w:t>. The Client must also still pay any remaining balance due to ONYX</w:t>
-      </w:r>
-      <w:r>
-        <w:rPr>
-          <w:highlight w:val="yellow"/>
-        </w:rPr>
-        <w:t xml:space="preserve"> after the Retainer is applied to the final invoice. We will refund to the Client any unearned balance remaining from the Retainer when we conclude our engagement</w:t>
+        <w:t>first invoice</w:t>
+      </w:r>
+      <w:r>
+        <w:rPr>
+          <w:highlight w:val="yellow"/>
+        </w:rPr>
+        <w:t>. The Client must pay any remaining balance due to ONYX</w:t>
+      </w:r>
+      <w:r>
+        <w:rPr>
+          <w:highlight w:val="yellow"/>
+        </w:rPr>
+        <w:t xml:space="preserve"> after the Retainer is applied to that invoice. If the first invoice is less than the Retainer, the unapplied balance will be carried forward to the following invoices. We will refund to the Client any unapplied balance remaining from the Retainer when we conclude our engagement</w:t>
       </w:r>
       <w:r>
         <w:rPr>

</xml_diff>